<commit_message>
changed bacecnd to vercel
</commit_message>
<xml_diff>
--- a/Planning Plotting/AUTOLINIUM APP.docx
+++ b/Planning Plotting/AUTOLINIUM APP.docx
@@ -7,7 +7,7 @@
         <w:pStyle w:val="Heading1"/>
         <w:jc w:val="center"/>
         <w:rPr>
-          <w:rFonts w:ascii="Aharoni" w:hAnsi="Aharoni" w:cs="Aharoni" w:hint="cs"/>
+          <w:rFonts w:ascii="Aharoni" w:hAnsi="Aharoni" w:cs="Aharoni"/>
         </w:rPr>
       </w:pPr>
       <w:r>
@@ -22,7 +22,7 @@
         <w:pStyle w:val="Heading1"/>
         <w:jc w:val="center"/>
         <w:rPr>
-          <w:rFonts w:ascii="Aharoni" w:hAnsi="Aharoni" w:cs="Aharoni" w:hint="cs"/>
+          <w:rFonts w:ascii="Aharoni" w:hAnsi="Aharoni" w:cs="Aharoni"/>
         </w:rPr>
       </w:pPr>
       <w:r>
@@ -51,7 +51,7 @@
     <w:p>
       <w:r>
         <w:pict w14:anchorId="002173E3">
-          <v:rect id="_x0000_i1716" style="width:0;height:1.5pt" o:hralign="center" o:hrstd="t" o:hr="t" fillcolor="#a0a0a0" stroked="f"/>
+          <v:rect id="_x0000_i1025" style="width:0;height:1.5pt" o:hralign="center" o:hrstd="t" o:hr="t" fillcolor="#a0a0a0" stroked="f"/>
         </w:pict>
       </w:r>
     </w:p>
@@ -182,7 +182,7 @@
     <w:p>
       <w:r>
         <w:pict w14:anchorId="1E677E32">
-          <v:rect id="_x0000_i1717" style="width:0;height:1.5pt" o:hralign="center" o:hrstd="t" o:hr="t" fillcolor="#a0a0a0" stroked="f"/>
+          <v:rect id="_x0000_i1026" style="width:0;height:1.5pt" o:hralign="center" o:hrstd="t" o:hr="t" fillcolor="#a0a0a0" stroked="f"/>
         </w:pict>
       </w:r>
     </w:p>
@@ -256,7 +256,7 @@
     <w:p>
       <w:r>
         <w:pict w14:anchorId="0360F685">
-          <v:rect id="_x0000_i1718" style="width:0;height:1.5pt" o:hralign="center" o:hrstd="t" o:hr="t" fillcolor="#a0a0a0" stroked="f"/>
+          <v:rect id="_x0000_i1027" style="width:0;height:1.5pt" o:hralign="center" o:hrstd="t" o:hr="t" fillcolor="#a0a0a0" stroked="f"/>
         </w:pict>
       </w:r>
     </w:p>
@@ -324,7 +324,7 @@
     <w:p>
       <w:r>
         <w:pict w14:anchorId="39DE1094">
-          <v:rect id="_x0000_i1719" style="width:0;height:1.5pt" o:hralign="center" o:hrstd="t" o:hr="t" fillcolor="#a0a0a0" stroked="f"/>
+          <v:rect id="_x0000_i1028" style="width:0;height:1.5pt" o:hralign="center" o:hrstd="t" o:hr="t" fillcolor="#a0a0a0" stroked="f"/>
         </w:pict>
       </w:r>
     </w:p>
@@ -598,13 +598,8 @@
       </w:r>
     </w:p>
     <w:p>
-      <w:proofErr w:type="gramStart"/>
-      <w:r>
-        <w:t>each</w:t>
-      </w:r>
-      <w:proofErr w:type="gramEnd"/>
-      <w:r>
-        <w:t xml:space="preserve"> Uninformed absence (−2) each Informed but not granted absence (−1) each Score min = 0, max = 10.</w:t>
+      <w:r>
+        <w:t>each Uninformed absence (−2) each Informed but not granted absence (−1) each Score min = 0, max = 10.</w:t>
       </w:r>
     </w:p>
     <w:p/>
@@ -673,87 +668,216 @@
           <w:bCs/>
         </w:rPr>
         <w:lastRenderedPageBreak/>
-        <w:t xml:space="preserve">6. Internal Meetings (KPI 3 - 10 pts) (To be </w:t>
-      </w:r>
-      <w:proofErr w:type="gramStart"/>
-      <w:r>
+        <w:t xml:space="preserve">6. Internal Meetings (KPI 3 - 10 pts) (To be filled by Admin) </w:t>
+      </w:r>
+    </w:p>
+    <w:p>
+      <w:r>
+        <w:t>For all the meetings attended in a month, will get 10/10.</w:t>
+      </w:r>
+    </w:p>
+    <w:p>
+      <w:r>
+        <w:t xml:space="preserve"> Fields: </w:t>
+      </w:r>
+    </w:p>
+    <w:p>
+      <w:r>
+        <w:t>• Meeting Name</w:t>
+      </w:r>
+    </w:p>
+    <w:p>
+      <w:r>
+        <w:t xml:space="preserve"> • Meeting Date </w:t>
+      </w:r>
+    </w:p>
+    <w:p>
+      <w:r>
+        <w:t xml:space="preserve">• Agenda </w:t>
+      </w:r>
+    </w:p>
+    <w:p>
+      <w:r>
+        <w:t xml:space="preserve">• </w:t>
+      </w:r>
+      <w:proofErr w:type="spellStart"/>
+      <w:r>
+        <w:t>employee_id</w:t>
+      </w:r>
+      <w:proofErr w:type="spellEnd"/>
+      <w:r>
+        <w:t xml:space="preserve"> (select, who attended it)</w:t>
+      </w:r>
+    </w:p>
+    <w:p>
+      <w:r>
+        <w:t xml:space="preserve"> • </w:t>
+      </w:r>
+      <w:proofErr w:type="spellStart"/>
+      <w:r>
+        <w:t>informed_skip</w:t>
+      </w:r>
+      <w:proofErr w:type="spellEnd"/>
+      <w:r>
+        <w:t xml:space="preserve"> (Select employee id)</w:t>
+      </w:r>
+    </w:p>
+    <w:p>
+      <w:r>
+        <w:t xml:space="preserve"> • </w:t>
+      </w:r>
+      <w:proofErr w:type="spellStart"/>
+      <w:r>
+        <w:t>uninformed_skip</w:t>
+      </w:r>
+      <w:proofErr w:type="spellEnd"/>
+      <w:r>
+        <w:t xml:space="preserve"> (Select Employee id) </w:t>
+      </w:r>
+    </w:p>
+    <w:p>
+      <w:r>
+        <w:t xml:space="preserve">Scoring: </w:t>
+      </w:r>
+    </w:p>
+    <w:p>
+      <w:r>
+        <w:t xml:space="preserve">• Informed Skip meeting → −1 </w:t>
+      </w:r>
+    </w:p>
+    <w:p>
+      <w:r>
+        <w:t xml:space="preserve">• Uninformed skip → −2 total </w:t>
+      </w:r>
+    </w:p>
+    <w:p/>
+    <w:p>
+      <w:pPr>
         <w:rPr>
           <w:b/>
           <w:bCs/>
         </w:rPr>
-        <w:t>filled</w:t>
-      </w:r>
-      <w:proofErr w:type="gramEnd"/>
+      </w:pPr>
       <w:r>
         <w:rPr>
           <w:b/>
           <w:bCs/>
         </w:rPr>
-        <w:t xml:space="preserve"> by Admin) </w:t>
-      </w:r>
-    </w:p>
-    <w:p>
-      <w:r>
-        <w:t xml:space="preserve">For all the meetings attended in a month, will </w:t>
+        <w:t xml:space="preserve">7. Client Meetings (KPI 4 — 10 pts) </w:t>
+      </w:r>
+    </w:p>
+    <w:p>
+      <w:r>
+        <w:t xml:space="preserve">Employees won’t see the </w:t>
       </w:r>
       <w:proofErr w:type="gramStart"/>
       <w:r>
-        <w:t>get</w:t>
+        <w:t>Admin’s</w:t>
       </w:r>
       <w:proofErr w:type="gramEnd"/>
       <w:r>
-        <w:t xml:space="preserve"> 10/10.</w:t>
-      </w:r>
-    </w:p>
-    <w:p>
-      <w:r>
-        <w:t xml:space="preserve"> Fields: </w:t>
-      </w:r>
-    </w:p>
-    <w:p>
-      <w:r>
-        <w:t>• Meeting Name</w:t>
-      </w:r>
-    </w:p>
-    <w:p>
-      <w:r>
-        <w:t xml:space="preserve"> • Meeting Date </w:t>
-      </w:r>
-    </w:p>
-    <w:p>
-      <w:r>
-        <w:t xml:space="preserve">• Agenda </w:t>
-      </w:r>
-    </w:p>
-    <w:p>
+        <w:t xml:space="preserve"> field. Give a Create a </w:t>
+      </w:r>
+      <w:proofErr w:type="gramStart"/>
+      <w:r>
+        <w:t>Client</w:t>
+      </w:r>
+      <w:proofErr w:type="gramEnd"/>
+      <w:r>
+        <w:t xml:space="preserve"> meeting Option. </w:t>
+      </w:r>
+    </w:p>
+    <w:p>
+      <w:r>
+        <w:t>Fields:</w:t>
+      </w:r>
+    </w:p>
+    <w:p>
+      <w:pPr>
+        <w:spacing w:line="240" w:lineRule="auto"/>
+      </w:pPr>
+      <w:r>
+        <w:t xml:space="preserve"> • Client’s name (Select from the client’s DB)</w:t>
+      </w:r>
+    </w:p>
+    <w:p>
+      <w:pPr>
+        <w:spacing w:line="240" w:lineRule="auto"/>
+      </w:pPr>
+      <w:r>
+        <w:t xml:space="preserve"> • Employee id (Select from the employee DB) </w:t>
+      </w:r>
+    </w:p>
+    <w:p>
+      <w:pPr>
+        <w:spacing w:line="240" w:lineRule="auto"/>
+      </w:pPr>
       <w:r>
         <w:t xml:space="preserve">• </w:t>
       </w:r>
       <w:proofErr w:type="spellStart"/>
       <w:r>
-        <w:t>employee_id</w:t>
+        <w:t>scheduled_time</w:t>
       </w:r>
       <w:proofErr w:type="spellEnd"/>
       <w:r>
-        <w:t xml:space="preserve"> (select, who attended it)</w:t>
-      </w:r>
-    </w:p>
-    <w:p>
-      <w:r>
-        <w:t xml:space="preserve"> • </w:t>
+        <w:t xml:space="preserve"> </w:t>
+      </w:r>
+    </w:p>
+    <w:p>
+      <w:pPr>
+        <w:spacing w:line="240" w:lineRule="auto"/>
+      </w:pPr>
+      <w:r>
+        <w:t xml:space="preserve">• </w:t>
       </w:r>
       <w:proofErr w:type="spellStart"/>
       <w:r>
+        <w:t>join_time</w:t>
+      </w:r>
+      <w:proofErr w:type="spellEnd"/>
+      <w:r>
+        <w:t xml:space="preserve"> </w:t>
+      </w:r>
+    </w:p>
+    <w:p>
+      <w:pPr>
+        <w:spacing w:line="240" w:lineRule="auto"/>
+      </w:pPr>
+      <w:r>
+        <w:t xml:space="preserve">• </w:t>
+      </w:r>
+      <w:proofErr w:type="spellStart"/>
+      <w:r>
+        <w:t>behavior_penalty</w:t>
+      </w:r>
+      <w:proofErr w:type="spellEnd"/>
+      <w:r>
+        <w:t xml:space="preserve"> (by admin) </w:t>
+      </w:r>
+    </w:p>
+    <w:p>
+      <w:pPr>
+        <w:spacing w:line="240" w:lineRule="auto"/>
+      </w:pPr>
+      <w:r>
+        <w:t xml:space="preserve">• </w:t>
+      </w:r>
+      <w:proofErr w:type="spellStart"/>
+      <w:r>
         <w:t>informed_skip</w:t>
       </w:r>
       <w:proofErr w:type="spellEnd"/>
       <w:r>
-        <w:t xml:space="preserve"> (Select employee id)</w:t>
-      </w:r>
-    </w:p>
-    <w:p>
-      <w:r>
-        <w:t xml:space="preserve"> • </w:t>
+        <w:t xml:space="preserve"> (By admin) </w:t>
+      </w:r>
+    </w:p>
+    <w:p>
+      <w:pPr>
+        <w:spacing w:line="240" w:lineRule="auto"/>
+      </w:pPr>
+      <w:r>
+        <w:t xml:space="preserve">• </w:t>
       </w:r>
       <w:proofErr w:type="spellStart"/>
       <w:r>
@@ -761,24 +885,42 @@
       </w:r>
       <w:proofErr w:type="spellEnd"/>
       <w:r>
-        <w:t xml:space="preserve"> (Select Employee id) </w:t>
-      </w:r>
-    </w:p>
-    <w:p>
-      <w:r>
-        <w:t xml:space="preserve">Scoring: </w:t>
-      </w:r>
-    </w:p>
-    <w:p>
-      <w:r>
-        <w:t xml:space="preserve">• Informed Skip meeting → −1 </w:t>
-      </w:r>
-    </w:p>
-    <w:p>
-      <w:r>
-        <w:t xml:space="preserve">• Uninformed skip → −2 total </w:t>
-      </w:r>
-    </w:p>
+        <w:t xml:space="preserve"> (By Admin) Scoring: </w:t>
+      </w:r>
+    </w:p>
+    <w:p>
+      <w:pPr>
+        <w:spacing w:line="240" w:lineRule="auto"/>
+      </w:pPr>
+      <w:r>
+        <w:t xml:space="preserve">• Every 5 min late → −0.5 </w:t>
+      </w:r>
+    </w:p>
+    <w:p>
+      <w:pPr>
+        <w:spacing w:line="240" w:lineRule="auto"/>
+      </w:pPr>
+      <w:r>
+        <w:t xml:space="preserve">• Informed absence → −3 </w:t>
+      </w:r>
+    </w:p>
+    <w:p>
+      <w:pPr>
+        <w:spacing w:line="240" w:lineRule="auto"/>
+      </w:pPr>
+      <w:r>
+        <w:t xml:space="preserve">• Uninformed absence → −6 </w:t>
+      </w:r>
+    </w:p>
+    <w:p>
+      <w:pPr>
+        <w:spacing w:line="240" w:lineRule="auto"/>
+      </w:pPr>
+      <w:r>
+        <w:t xml:space="preserve">• Behavior penalty → admin defined (0–10) </w:t>
+      </w:r>
+    </w:p>
+    <w:p/>
     <w:p/>
     <w:p>
       <w:pPr>
@@ -792,61 +934,145 @@
           <w:b/>
           <w:bCs/>
         </w:rPr>
-        <w:t xml:space="preserve">7. Client Meetings (KPI 4 — 10 pts) </w:t>
-      </w:r>
-    </w:p>
-    <w:p>
-      <w:r>
-        <w:t xml:space="preserve">Employees won’t see the </w:t>
+        <w:t xml:space="preserve"> 8. Peer Review (KPI 5 — 10 pts) Monthly process: </w:t>
+      </w:r>
+    </w:p>
+    <w:p>
+      <w:pPr>
+        <w:spacing w:line="240" w:lineRule="auto"/>
+      </w:pPr>
+      <w:r>
+        <w:t xml:space="preserve">• On 7th of month, notification sent to each </w:t>
       </w:r>
       <w:proofErr w:type="gramStart"/>
       <w:r>
-        <w:t>Admin’s</w:t>
+        <w:t>members</w:t>
       </w:r>
       <w:proofErr w:type="gramEnd"/>
       <w:r>
-        <w:t xml:space="preserve"> field. Give a Create a </w:t>
+        <w:t xml:space="preserve"> of the </w:t>
+      </w:r>
+      <w:proofErr w:type="spellStart"/>
+      <w:r>
+        <w:t>autolinium</w:t>
+      </w:r>
+      <w:proofErr w:type="spellEnd"/>
+      <w:r>
+        <w:t xml:space="preserve"> including admin to give marks to all of their colleagues. </w:t>
+      </w:r>
+    </w:p>
+    <w:p>
+      <w:pPr>
+        <w:spacing w:line="240" w:lineRule="auto"/>
+      </w:pPr>
+      <w:r>
+        <w:t xml:space="preserve">• On the rating page, there must be the following instructions. Rate your colleagues based on </w:t>
+      </w:r>
+    </w:p>
+    <w:p>
+      <w:pPr>
+        <w:spacing w:line="240" w:lineRule="auto"/>
+      </w:pPr>
+      <w:r>
+        <w:t xml:space="preserve">• If they have treated you respectfully or not. </w:t>
+      </w:r>
+    </w:p>
+    <w:p>
+      <w:pPr>
+        <w:spacing w:line="240" w:lineRule="auto"/>
+      </w:pPr>
+      <w:r>
+        <w:t xml:space="preserve">• Do they help teammates when they face difficulties or not? </w:t>
+      </w:r>
+    </w:p>
+    <w:p>
+      <w:pPr>
+        <w:spacing w:line="240" w:lineRule="auto"/>
+      </w:pPr>
+      <w:r>
+        <w:t>• If they maintain a positive attitude at the workplace or not.</w:t>
+      </w:r>
+    </w:p>
+    <w:p>
+      <w:pPr>
+        <w:spacing w:line="240" w:lineRule="auto"/>
+      </w:pPr>
+      <w:r>
+        <w:t xml:space="preserve"> • If they avoid unnecessary conflict or arguments or not. </w:t>
+      </w:r>
+    </w:p>
+    <w:p>
+      <w:pPr>
+        <w:spacing w:line="240" w:lineRule="auto"/>
+      </w:pPr>
+      <w:r>
+        <w:t xml:space="preserve">• If they share knowledge and support others’ growth or not. Note: Accept the feedback you’ll receive professionally. </w:t>
+      </w:r>
+    </w:p>
+    <w:p>
+      <w:pPr>
+        <w:spacing w:line="240" w:lineRule="auto"/>
+      </w:pPr>
+      <w:r>
+        <w:t>• Employees rate all colleagues (1–10) Score: Average rating received. Only admin will see the ratings that everyone provides. Employees will see the average rating only.</w:t>
+      </w:r>
+    </w:p>
+    <w:p>
+      <w:r>
+        <w:t xml:space="preserve"> </w:t>
+      </w:r>
+    </w:p>
+    <w:p>
+      <w:pPr>
+        <w:rPr>
+          <w:b/>
+          <w:bCs/>
+        </w:rPr>
+      </w:pPr>
+      <w:r>
+        <w:rPr>
+          <w:b/>
+          <w:bCs/>
+        </w:rPr>
+        <w:t>9. Deadline KPI (KPI 6 — 10 pts)</w:t>
+      </w:r>
+    </w:p>
+    <w:p>
+      <w:r>
+        <w:t>A Deadline Page will be available to each employee's interface. The source of this interface is the Projects Table. Here, all the deadlines of the assigned projects will be shown. Once the task is done, they will change the status (There will be 2 statuses. Generally</w:t>
+      </w:r>
+      <w:r>
+        <w:t>,</w:t>
+      </w:r>
+      <w:r>
+        <w:t xml:space="preserve"> it’s Pending, once the employee does </w:t>
       </w:r>
       <w:proofErr w:type="gramStart"/>
       <w:r>
-        <w:t>Client</w:t>
+        <w:t>it</w:t>
       </w:r>
       <w:proofErr w:type="gramEnd"/>
       <w:r>
-        <w:t xml:space="preserve"> meeting Option. </w:t>
-      </w:r>
-    </w:p>
-    <w:p>
-      <w:r>
-        <w:t>Fields:</w:t>
-      </w:r>
-    </w:p>
-    <w:p>
-      <w:pPr>
-        <w:spacing w:line="240" w:lineRule="auto"/>
-      </w:pPr>
-      <w:r>
-        <w:t xml:space="preserve"> • Client’s name (Select from the client’s DB)</w:t>
-      </w:r>
-    </w:p>
-    <w:p>
-      <w:pPr>
-        <w:spacing w:line="240" w:lineRule="auto"/>
-      </w:pPr>
-      <w:r>
-        <w:t xml:space="preserve"> • Employee id (Select from the employee DB) </w:t>
-      </w:r>
-    </w:p>
-    <w:p>
-      <w:pPr>
-        <w:spacing w:line="240" w:lineRule="auto"/>
-      </w:pPr>
+        <w:t xml:space="preserve"> they will select Done.) If the task is done after the deadline, the penalties will be applied if they personally don’t provide a valid reason to the admin. Admin can change the ratings from their view. </w:t>
+      </w:r>
+    </w:p>
+    <w:p>
+      <w:r>
+        <w:t xml:space="preserve">Task fields: </w:t>
+      </w:r>
+    </w:p>
+    <w:p>
+      <w:r>
+        <w:t xml:space="preserve">• deadline </w:t>
+      </w:r>
+    </w:p>
+    <w:p>
       <w:r>
         <w:t xml:space="preserve">• </w:t>
       </w:r>
       <w:proofErr w:type="spellStart"/>
       <w:r>
-        <w:t>scheduled_time</w:t>
+        <w:t>completed_date</w:t>
       </w:r>
       <w:proofErr w:type="spellEnd"/>
       <w:r>
@@ -854,15 +1080,12 @@
       </w:r>
     </w:p>
     <w:p>
-      <w:pPr>
-        <w:spacing w:line="240" w:lineRule="auto"/>
-      </w:pPr>
       <w:r>
         <w:t xml:space="preserve">• </w:t>
       </w:r>
       <w:proofErr w:type="spellStart"/>
       <w:r>
-        <w:t>join_time</w:t>
+        <w:t>valid_reason</w:t>
       </w:r>
       <w:proofErr w:type="spellEnd"/>
       <w:r>
@@ -870,83 +1093,54 @@
       </w:r>
     </w:p>
     <w:p>
-      <w:pPr>
-        <w:spacing w:line="240" w:lineRule="auto"/>
-      </w:pPr>
       <w:r>
         <w:t xml:space="preserve">• </w:t>
       </w:r>
       <w:proofErr w:type="spellStart"/>
       <w:r>
-        <w:t>behavior_penalty</w:t>
+        <w:t>informed_before_deadline</w:t>
       </w:r>
       <w:proofErr w:type="spellEnd"/>
       <w:r>
-        <w:t xml:space="preserve"> (by admin) </w:t>
-      </w:r>
-    </w:p>
-    <w:p>
-      <w:pPr>
-        <w:spacing w:line="240" w:lineRule="auto"/>
-      </w:pPr>
-      <w:r>
-        <w:t xml:space="preserve">• </w:t>
+        <w:t xml:space="preserve"> </w:t>
+      </w:r>
+    </w:p>
+    <w:p>
+      <w:r>
+        <w:t xml:space="preserve">If delay AND both flags false: </w:t>
       </w:r>
       <w:proofErr w:type="spellStart"/>
       <w:r>
-        <w:t>informed_skip</w:t>
+        <w:t>fault_delay_days</w:t>
       </w:r>
       <w:proofErr w:type="spellEnd"/>
       <w:r>
-        <w:t xml:space="preserve"> (By admin) </w:t>
-      </w:r>
-    </w:p>
-    <w:p>
-      <w:pPr>
-        <w:spacing w:line="240" w:lineRule="auto"/>
-      </w:pPr>
-      <w:r>
-        <w:t xml:space="preserve">• </w:t>
+        <w:t xml:space="preserve"> = </w:t>
       </w:r>
       <w:proofErr w:type="spellStart"/>
       <w:r>
-        <w:t>uninformed_skip</w:t>
+        <w:t>completed_date</w:t>
       </w:r>
       <w:proofErr w:type="spellEnd"/>
       <w:r>
-        <w:t xml:space="preserve"> (By Admin) Scoring: </w:t>
-      </w:r>
-    </w:p>
-    <w:p>
-      <w:pPr>
-        <w:spacing w:line="240" w:lineRule="auto"/>
-      </w:pPr>
-      <w:r>
-        <w:t xml:space="preserve">• Every 5 min late → −0.5 </w:t>
-      </w:r>
-    </w:p>
-    <w:p>
-      <w:pPr>
-        <w:spacing w:line="240" w:lineRule="auto"/>
-      </w:pPr>
-      <w:r>
-        <w:t xml:space="preserve">• Informed absence → −3 </w:t>
-      </w:r>
-    </w:p>
-    <w:p>
-      <w:pPr>
-        <w:spacing w:line="240" w:lineRule="auto"/>
-      </w:pPr>
-      <w:r>
-        <w:t xml:space="preserve">• Uninformed absence → −6 </w:t>
-      </w:r>
-    </w:p>
-    <w:p>
-      <w:pPr>
-        <w:spacing w:line="240" w:lineRule="auto"/>
-      </w:pPr>
-      <w:r>
-        <w:t xml:space="preserve">• Behavior penalty → admin defined (0–10) </w:t>
+        <w:t xml:space="preserve"> </w:t>
+      </w:r>
+      <w:r>
+        <w:t>–</w:t>
+      </w:r>
+      <w:r>
+        <w:t xml:space="preserve"> deadline</w:t>
+      </w:r>
+    </w:p>
+    <w:p>
+      <w:r>
+        <w:t xml:space="preserve"> Penalty = 0.5 × days </w:t>
+      </w:r>
+    </w:p>
+    <w:p>
+      <w:r>
+        <w:lastRenderedPageBreak/>
+        <w:t xml:space="preserve">KPI6 = 10 − penalty </w:t>
       </w:r>
     </w:p>
     <w:p/>
@@ -963,123 +1157,38 @@
           <w:b/>
           <w:bCs/>
         </w:rPr>
-        <w:t xml:space="preserve"> 8. Peer Review (KPI 5 — 10 pts) Monthly process: </w:t>
-      </w:r>
-    </w:p>
-    <w:p>
-      <w:pPr>
-        <w:spacing w:line="240" w:lineRule="auto"/>
-      </w:pPr>
-      <w:r>
-        <w:t xml:space="preserve">• On 7th of month, </w:t>
-      </w:r>
-      <w:proofErr w:type="gramStart"/>
-      <w:r>
-        <w:t>notification</w:t>
-      </w:r>
-      <w:proofErr w:type="gramEnd"/>
-      <w:r>
-        <w:t xml:space="preserve"> sent to each </w:t>
-      </w:r>
-      <w:proofErr w:type="gramStart"/>
-      <w:r>
-        <w:t>members</w:t>
-      </w:r>
-      <w:proofErr w:type="gramEnd"/>
-      <w:r>
-        <w:t xml:space="preserve"> of the </w:t>
+        <w:t xml:space="preserve">10. Weekly Report (KPI 7 — 10 pts) </w:t>
+      </w:r>
+    </w:p>
+    <w:p>
+      <w:r>
+        <w:t xml:space="preserve">Sent a </w:t>
       </w:r>
       <w:proofErr w:type="spellStart"/>
-      <w:proofErr w:type="gramStart"/>
-      <w:r>
-        <w:t>autolinium</w:t>
+      <w:r>
+        <w:t>lotification</w:t>
       </w:r>
       <w:proofErr w:type="spellEnd"/>
       <w:r>
-        <w:t xml:space="preserve"> including</w:t>
-      </w:r>
-      <w:proofErr w:type="gramEnd"/>
-      <w:r>
-        <w:t xml:space="preserve"> admin to give marks to </w:t>
-      </w:r>
-      <w:proofErr w:type="gramStart"/>
-      <w:r>
-        <w:t>all of</w:t>
-      </w:r>
-      <w:proofErr w:type="gramEnd"/>
-      <w:r>
-        <w:t xml:space="preserve"> their colleagues. </w:t>
-      </w:r>
-    </w:p>
-    <w:p>
-      <w:pPr>
-        <w:spacing w:line="240" w:lineRule="auto"/>
-      </w:pPr>
-      <w:r>
-        <w:t xml:space="preserve">• On the rating page, there must be the following instructions. Rate your colleagues based on </w:t>
-      </w:r>
-    </w:p>
-    <w:p>
-      <w:pPr>
-        <w:spacing w:line="240" w:lineRule="auto"/>
-      </w:pPr>
-      <w:r>
-        <w:t xml:space="preserve">• If they have treated you respectfully or not. </w:t>
-      </w:r>
-    </w:p>
-    <w:p>
-      <w:pPr>
-        <w:spacing w:line="240" w:lineRule="auto"/>
-      </w:pPr>
-      <w:r>
-        <w:t xml:space="preserve">• Do they help teammates when they face difficulties or not? </w:t>
-      </w:r>
-    </w:p>
-    <w:p>
-      <w:pPr>
-        <w:spacing w:line="240" w:lineRule="auto"/>
-      </w:pPr>
-      <w:r>
-        <w:t>• If they maintain a positive attitude at the workplace or not.</w:t>
-      </w:r>
-    </w:p>
-    <w:p>
-      <w:pPr>
-        <w:spacing w:line="240" w:lineRule="auto"/>
-      </w:pPr>
-      <w:r>
-        <w:t xml:space="preserve"> • If they avoid unnecessary conflict or arguments or not. </w:t>
-      </w:r>
-    </w:p>
-    <w:p>
-      <w:pPr>
-        <w:spacing w:line="240" w:lineRule="auto"/>
-      </w:pPr>
-      <w:r>
-        <w:t xml:space="preserve">• If they share knowledge and support others’ growth or not. Note: Accept the feedback you’ll receive professionally. </w:t>
-      </w:r>
-    </w:p>
-    <w:p>
-      <w:pPr>
-        <w:spacing w:line="240" w:lineRule="auto"/>
-      </w:pPr>
-      <w:r>
-        <w:t xml:space="preserve">• Employees rate all colleagues (1–10) Score: Average rating received. Only </w:t>
-      </w:r>
-      <w:proofErr w:type="gramStart"/>
-      <w:r>
-        <w:t>admin</w:t>
-      </w:r>
-      <w:proofErr w:type="gramEnd"/>
-      <w:r>
-        <w:t xml:space="preserve"> will see the ratings that everyone provides. Employees will see the average rating only.</w:t>
-      </w:r>
-    </w:p>
-    <w:p>
-      <w:r>
-        <w:t xml:space="preserve"> </w:t>
-      </w:r>
-    </w:p>
+        <w:t xml:space="preserve"> every Thursday 2 PM Due Friday 2 PM There will be a form similar to Penalties:</w:t>
+      </w:r>
+    </w:p>
+    <w:p>
+      <w:r>
+        <w:t xml:space="preserve">Action Deduction Late submission −3 </w:t>
+      </w:r>
+    </w:p>
+    <w:p>
+      <w:r>
+        <w:t xml:space="preserve">Missed submission −6 </w:t>
+      </w:r>
+    </w:p>
+    <w:p>
+      <w:r>
+        <w:t xml:space="preserve">Missing knowledge share −2 </w:t>
+      </w:r>
+    </w:p>
+    <w:p/>
     <w:p>
       <w:pPr>
         <w:rPr>
@@ -1092,115 +1201,29 @@
           <w:b/>
           <w:bCs/>
         </w:rPr>
-        <w:t>9. Deadline KPI (KPI 6 — 10 pts)</w:t>
-      </w:r>
-    </w:p>
-    <w:p>
-      <w:r>
-        <w:t>A Deadline Page will be available to each employee's interface. The source of this interface is the Projects Table. Here, all the deadlines of the assigned projects will be shown. Once the task is done, they will change the status (There will be 2 statuses. Generally</w:t>
-      </w:r>
-      <w:r>
-        <w:t>,</w:t>
-      </w:r>
-      <w:r>
-        <w:t xml:space="preserve"> it’s Pending, once the employee does </w:t>
-      </w:r>
-      <w:proofErr w:type="gramStart"/>
-      <w:r>
-        <w:t>it</w:t>
-      </w:r>
-      <w:proofErr w:type="gramEnd"/>
-      <w:r>
-        <w:t xml:space="preserve"> they will select Done.) If the task is done after the deadline, the penalties will be applied if they personally don’t provide a valid reason </w:t>
-      </w:r>
-      <w:proofErr w:type="gramStart"/>
-      <w:r>
-        <w:t>to</w:t>
-      </w:r>
-      <w:proofErr w:type="gramEnd"/>
-      <w:r>
-        <w:t xml:space="preserve"> the admin. Admin can change the ratings from their view. </w:t>
-      </w:r>
-    </w:p>
-    <w:p>
-      <w:r>
-        <w:t xml:space="preserve">Task fields: </w:t>
-      </w:r>
-    </w:p>
-    <w:p>
-      <w:r>
-        <w:t xml:space="preserve">• deadline </w:t>
-      </w:r>
-    </w:p>
-    <w:p>
-      <w:r>
-        <w:t xml:space="preserve">• </w:t>
-      </w:r>
-      <w:proofErr w:type="spellStart"/>
-      <w:r>
-        <w:t>completed_date</w:t>
-      </w:r>
-      <w:proofErr w:type="spellEnd"/>
-      <w:r>
-        <w:t xml:space="preserve"> </w:t>
-      </w:r>
-    </w:p>
-    <w:p>
-      <w:r>
-        <w:t xml:space="preserve">• </w:t>
-      </w:r>
-      <w:proofErr w:type="spellStart"/>
-      <w:r>
-        <w:t>valid_reason</w:t>
-      </w:r>
-      <w:proofErr w:type="spellEnd"/>
-      <w:r>
-        <w:t xml:space="preserve"> </w:t>
-      </w:r>
-    </w:p>
-    <w:p>
-      <w:r>
-        <w:t xml:space="preserve">• </w:t>
-      </w:r>
-      <w:proofErr w:type="spellStart"/>
-      <w:r>
-        <w:t>informed_before_deadline</w:t>
-      </w:r>
-      <w:proofErr w:type="spellEnd"/>
-      <w:r>
-        <w:t xml:space="preserve"> </w:t>
-      </w:r>
-    </w:p>
-    <w:p>
-      <w:r>
-        <w:t xml:space="preserve">If delay AND both flags </w:t>
-      </w:r>
-      <w:proofErr w:type="gramStart"/>
-      <w:r>
-        <w:t>false</w:t>
-      </w:r>
-      <w:proofErr w:type="gramEnd"/>
-      <w:r>
-        <w:t xml:space="preserve">: </w:t>
-      </w:r>
-      <w:proofErr w:type="spellStart"/>
-      <w:r>
-        <w:t>fault_delay_days</w:t>
-      </w:r>
-      <w:proofErr w:type="spellEnd"/>
-      <w:r>
-        <w:t xml:space="preserve"> = </w:t>
-      </w:r>
-      <w:proofErr w:type="spellStart"/>
-      <w:r>
-        <w:t>completed_date</w:t>
-      </w:r>
-      <w:proofErr w:type="spellEnd"/>
-      <w:r>
-        <w:t xml:space="preserve"> − deadline Penalty = 0.5 × days KPI6 = 10 − penalty </w:t>
-      </w:r>
-    </w:p>
-    <w:p/>
+        <w:t xml:space="preserve">11. KPI 8 - Value Added (0–25 pts) </w:t>
+      </w:r>
+    </w:p>
+    <w:p>
+      <w:r>
+        <w:t xml:space="preserve">Employees page will be view only. Admin can edit. Admin manually enters the monthly score. Examples: </w:t>
+      </w:r>
+    </w:p>
+    <w:p>
+      <w:r>
+        <w:t xml:space="preserve">• Revenue contribution </w:t>
+      </w:r>
+    </w:p>
+    <w:p>
+      <w:r>
+        <w:t xml:space="preserve">• Client retention </w:t>
+      </w:r>
+    </w:p>
+    <w:p>
+      <w:r>
+        <w:t xml:space="preserve">• Efficiency improvements </w:t>
+      </w:r>
+    </w:p>
     <w:p/>
     <w:p>
       <w:pPr>
@@ -1214,51 +1237,41 @@
           <w:b/>
           <w:bCs/>
         </w:rPr>
-        <w:t xml:space="preserve">10. Weekly Report (KPI 7 — 10 pts) </w:t>
-      </w:r>
-    </w:p>
-    <w:p>
-      <w:proofErr w:type="gramStart"/>
-      <w:r>
-        <w:t>Sent</w:t>
-      </w:r>
-      <w:proofErr w:type="gramEnd"/>
-      <w:r>
-        <w:t xml:space="preserve"> a </w:t>
-      </w:r>
-      <w:proofErr w:type="spellStart"/>
-      <w:r>
-        <w:t>lotification</w:t>
-      </w:r>
-      <w:proofErr w:type="spellEnd"/>
-      <w:r>
-        <w:t xml:space="preserve"> every Thursday 2 PM Due Friday 2 PM There will be a form </w:t>
-      </w:r>
-      <w:proofErr w:type="gramStart"/>
-      <w:r>
-        <w:t>similar to</w:t>
-      </w:r>
-      <w:proofErr w:type="gramEnd"/>
-      <w:r>
-        <w:t xml:space="preserve"> Penalties:</w:t>
-      </w:r>
-    </w:p>
-    <w:p>
-      <w:r>
-        <w:t xml:space="preserve">Action Deduction Late submission −3 </w:t>
-      </w:r>
-    </w:p>
-    <w:p>
-      <w:r>
-        <w:t xml:space="preserve">Missed submission −6 </w:t>
-      </w:r>
-    </w:p>
-    <w:p>
-      <w:r>
-        <w:t xml:space="preserve">Missing knowledge share −2 </w:t>
-      </w:r>
-    </w:p>
-    <w:p/>
+        <w:t xml:space="preserve">12. KPI 9 — Innovation (0–5 pts) </w:t>
+      </w:r>
+    </w:p>
+    <w:p>
+      <w:r>
+        <w:t xml:space="preserve">Employees page will be view only. Admin enters score for: </w:t>
+      </w:r>
+    </w:p>
+    <w:p>
+      <w:r>
+        <w:t xml:space="preserve">• New ideas </w:t>
+      </w:r>
+    </w:p>
+    <w:p>
+      <w:r>
+        <w:t xml:space="preserve">• Process improvements </w:t>
+      </w:r>
+    </w:p>
+    <w:p>
+      <w:r>
+        <w:t xml:space="preserve">• Product ideas </w:t>
+      </w:r>
+    </w:p>
+    <w:p>
+      <w:r>
+        <w:t>• Automation innovations</w:t>
+      </w:r>
+    </w:p>
+    <w:p>
+      <w:r>
+        <w:pict w14:anchorId="5947EF30">
+          <v:rect id="_x0000_i1029" style="width:0;height:1.5pt" o:hralign="center" o:hrstd="t" o:hr="t" fillcolor="#a0a0a0" stroked="f"/>
+        </w:pict>
+      </w:r>
+    </w:p>
     <w:p>
       <w:pPr>
         <w:rPr>
@@ -1271,38 +1284,32 @@
           <w:b/>
           <w:bCs/>
         </w:rPr>
-        <w:t xml:space="preserve">11. KPI 8 - Value Added (0–25 pts) </w:t>
-      </w:r>
-    </w:p>
-    <w:p>
-      <w:r>
-        <w:t xml:space="preserve">Employees page will be </w:t>
-      </w:r>
-      <w:proofErr w:type="gramStart"/>
-      <w:r>
-        <w:t>view</w:t>
-      </w:r>
-      <w:proofErr w:type="gramEnd"/>
-      <w:r>
-        <w:t xml:space="preserve"> only. Admin can edit. Admin manually enters the monthly score. Examples: </w:t>
-      </w:r>
-    </w:p>
-    <w:p>
-      <w:r>
-        <w:t xml:space="preserve">• Revenue contribution </w:t>
-      </w:r>
-    </w:p>
-    <w:p>
-      <w:r>
-        <w:t xml:space="preserve">• Client retention </w:t>
-      </w:r>
-    </w:p>
-    <w:p>
-      <w:r>
-        <w:t xml:space="preserve">• Efficiency improvements </w:t>
-      </w:r>
-    </w:p>
-    <w:p/>
+        <w:t>13. KPI Total Calculation</w:t>
+      </w:r>
+    </w:p>
+    <w:p>
+      <w:r>
+        <w:t>KPI Total =</w:t>
+      </w:r>
+    </w:p>
+    <w:p>
+      <w:r>
+        <w:t>KPI1+KPI2+KPI3+KPI4+KPI5+KPI6+KPI7+KPI8+KPI9</w:t>
+      </w:r>
+    </w:p>
+    <w:p>
+      <w:r>
+        <w:lastRenderedPageBreak/>
+        <w:t>Max Score = 100</w:t>
+      </w:r>
+    </w:p>
+    <w:p>
+      <w:r>
+        <w:pict w14:anchorId="37AFEE9D">
+          <v:rect id="_x0000_i1030" style="width:0;height:1.5pt" o:hralign="center" o:hrstd="t" o:hr="t" fillcolor="#a0a0a0" stroked="f"/>
+        </w:pict>
+      </w:r>
+    </w:p>
     <w:p>
       <w:pPr>
         <w:rPr>
@@ -1310,112 +1317,19 @@
           <w:bCs/>
         </w:rPr>
       </w:pPr>
-      <w:r>
+    </w:p>
+    <w:p>
+      <w:pPr>
         <w:rPr>
           <w:b/>
           <w:bCs/>
         </w:rPr>
-        <w:t xml:space="preserve">12. KPI 9 — Innovation (0–5 pts) </w:t>
-      </w:r>
-    </w:p>
-    <w:p>
-      <w:r>
-        <w:t xml:space="preserve">Employees page will be </w:t>
-      </w:r>
-      <w:proofErr w:type="gramStart"/>
-      <w:r>
-        <w:t>view</w:t>
-      </w:r>
-      <w:proofErr w:type="gramEnd"/>
-      <w:r>
-        <w:t xml:space="preserve"> only. Admin enters score for: </w:t>
-      </w:r>
-    </w:p>
-    <w:p>
-      <w:r>
-        <w:t xml:space="preserve">• New ideas </w:t>
-      </w:r>
-    </w:p>
-    <w:p>
-      <w:r>
-        <w:t xml:space="preserve">• Process improvements </w:t>
-      </w:r>
-    </w:p>
-    <w:p>
-      <w:r>
-        <w:t xml:space="preserve">• Product ideas </w:t>
-      </w:r>
-    </w:p>
-    <w:p>
-      <w:r>
-        <w:t>• Automation innovations</w:t>
-      </w:r>
-    </w:p>
-    <w:p>
-      <w:r>
-        <w:pict w14:anchorId="5947EF30">
-          <v:rect id="_x0000_i1731" style="width:0;height:1.5pt" o:hralign="center" o:hrstd="t" o:hr="t" fillcolor="#a0a0a0" stroked="f"/>
-        </w:pict>
-      </w:r>
-    </w:p>
-    <w:p>
-      <w:pPr>
+      </w:pPr>
+      <w:r>
         <w:rPr>
           <w:b/>
           <w:bCs/>
         </w:rPr>
-      </w:pPr>
-      <w:r>
-        <w:rPr>
-          <w:b/>
-          <w:bCs/>
-        </w:rPr>
-        <w:t>13. KPI Total Calculation</w:t>
-      </w:r>
-    </w:p>
-    <w:p>
-      <w:r>
-        <w:t>KPI Total =</w:t>
-      </w:r>
-    </w:p>
-    <w:p>
-      <w:r>
-        <w:t>KPI1+KPI2+KPI3+KPI4+KPI5+KPI6+KPI7+KPI8+KPI9</w:t>
-      </w:r>
-    </w:p>
-    <w:p>
-      <w:r>
-        <w:t>Max Score = 100</w:t>
-      </w:r>
-    </w:p>
-    <w:p>
-      <w:r>
-        <w:lastRenderedPageBreak/>
-        <w:pict w14:anchorId="37AFEE9D">
-          <v:rect id="_x0000_i1732" style="width:0;height:1.5pt" o:hralign="center" o:hrstd="t" o:hr="t" fillcolor="#a0a0a0" stroked="f"/>
-        </w:pict>
-      </w:r>
-    </w:p>
-    <w:p>
-      <w:pPr>
-        <w:rPr>
-          <w:b/>
-          <w:bCs/>
-        </w:rPr>
-      </w:pPr>
-    </w:p>
-    <w:p>
-      <w:pPr>
-        <w:rPr>
-          <w:b/>
-          <w:bCs/>
-        </w:rPr>
-      </w:pPr>
-      <w:r>
-        <w:rPr>
-          <w:b/>
-          <w:bCs/>
-        </w:rPr>
         <w:t>14. Bonus Calculation</w:t>
       </w:r>
     </w:p>
@@ -1432,7 +1346,7 @@
     <w:p>
       <w:r>
         <w:pict w14:anchorId="7361BF45">
-          <v:rect id="_x0000_i1733" style="width:0;height:1.5pt" o:hralign="center" o:hrstd="t" o:hr="t" fillcolor="#a0a0a0" stroked="f"/>
+          <v:rect id="_x0000_i1031" style="width:0;height:1.5pt" o:hralign="center" o:hrstd="t" o:hr="t" fillcolor="#a0a0a0" stroked="f"/>
         </w:pict>
       </w:r>
     </w:p>
@@ -1643,7 +1557,7 @@
     <w:p>
       <w:r>
         <w:pict w14:anchorId="07F3A9CA">
-          <v:rect id="_x0000_i1734" style="width:0;height:1.5pt" o:hralign="center" o:hrstd="t" o:hr="t" fillcolor="#a0a0a0" stroked="f"/>
+          <v:rect id="_x0000_i1032" style="width:0;height:1.5pt" o:hralign="center" o:hrstd="t" o:hr="t" fillcolor="#a0a0a0" stroked="f"/>
         </w:pict>
       </w:r>
     </w:p>
@@ -1652,7 +1566,7 @@
         <w:pStyle w:val="Heading2"/>
         <w:jc w:val="center"/>
         <w:rPr>
-          <w:rFonts w:ascii="Aharoni" w:hAnsi="Aharoni" w:cs="Aharoni" w:hint="cs"/>
+          <w:rFonts w:ascii="Aharoni" w:hAnsi="Aharoni" w:cs="Aharoni"/>
         </w:rPr>
       </w:pPr>
       <w:r>
@@ -1707,9 +1621,8 @@
     <w:p/>
     <w:p>
       <w:r>
-        <w:lastRenderedPageBreak/>
         <w:pict w14:anchorId="29C55744">
-          <v:rect id="_x0000_i1735" style="width:0;height:1.5pt" o:hralign="center" o:hrstd="t" o:hr="t" fillcolor="#a0a0a0" stroked="f"/>
+          <v:rect id="_x0000_i1033" style="width:0;height:1.5pt" o:hralign="center" o:hrstd="t" o:hr="t" fillcolor="#a0a0a0" stroked="f"/>
         </w:pict>
       </w:r>
     </w:p>
@@ -1718,7 +1631,7 @@
         <w:pStyle w:val="Heading2"/>
         <w:jc w:val="center"/>
         <w:rPr>
-          <w:rFonts w:ascii="Aharoni" w:hAnsi="Aharoni" w:cs="Aharoni" w:hint="cs"/>
+          <w:rFonts w:ascii="Aharoni" w:hAnsi="Aharoni" w:cs="Aharoni"/>
         </w:rPr>
       </w:pPr>
       <w:r>
@@ -1782,7 +1695,7 @@
     <w:p>
       <w:r>
         <w:pict w14:anchorId="12B19DFA">
-          <v:rect id="_x0000_i1736" style="width:0;height:1.5pt" o:hralign="center" o:hrstd="t" o:hr="t" fillcolor="#a0a0a0" stroked="f"/>
+          <v:rect id="_x0000_i1034" style="width:0;height:1.5pt" o:hralign="center" o:hrstd="t" o:hr="t" fillcolor="#a0a0a0" stroked="f"/>
         </w:pict>
       </w:r>
     </w:p>
@@ -1829,7 +1742,7 @@
     <w:p>
       <w:r>
         <w:pict w14:anchorId="4306443B">
-          <v:rect id="_x0000_i1737" style="width:0;height:1.5pt" o:hralign="center" o:hrstd="t" o:hr="t" fillcolor="#a0a0a0" stroked="f"/>
+          <v:rect id="_x0000_i1035" style="width:0;height:1.5pt" o:hralign="center" o:hrstd="t" o:hr="t" fillcolor="#a0a0a0" stroked="f"/>
         </w:pict>
       </w:r>
     </w:p>
@@ -1876,7 +1789,7 @@
     <w:p>
       <w:r>
         <w:pict w14:anchorId="62745F0D">
-          <v:rect id="_x0000_i1738" style="width:0;height:1.5pt" o:hralign="center" o:hrstd="t" o:hr="t" fillcolor="#a0a0a0" stroked="f"/>
+          <v:rect id="_x0000_i1036" style="width:0;height:1.5pt" o:hralign="center" o:hrstd="t" o:hr="t" fillcolor="#a0a0a0" stroked="f"/>
         </w:pict>
       </w:r>
     </w:p>
@@ -1909,6 +1822,9 @@
       </w:r>
       <w:r>
         <w:br/>
+      </w:r>
+      <w:r>
+        <w:lastRenderedPageBreak/>
         <w:t>• Review client meetings</w:t>
       </w:r>
       <w:r>
@@ -1926,9 +1842,8 @@
     </w:p>
     <w:p>
       <w:r>
-        <w:lastRenderedPageBreak/>
         <w:pict w14:anchorId="256F6AD6">
-          <v:rect id="_x0000_i1739" style="width:0;height:1.5pt" o:hralign="center" o:hrstd="t" o:hr="t" fillcolor="#a0a0a0" stroked="f"/>
+          <v:rect id="_x0000_i1037" style="width:0;height:1.5pt" o:hralign="center" o:hrstd="t" o:hr="t" fillcolor="#a0a0a0" stroked="f"/>
         </w:pict>
       </w:r>
     </w:p>
@@ -1971,7 +1886,7 @@
     <w:p>
       <w:r>
         <w:pict w14:anchorId="3E6269E9">
-          <v:rect id="_x0000_i1740" style="width:0;height:1.5pt" o:hralign="center" o:hrstd="t" o:hr="t" fillcolor="#a0a0a0" stroked="f"/>
+          <v:rect id="_x0000_i1038" style="width:0;height:1.5pt" o:hralign="center" o:hrstd="t" o:hr="t" fillcolor="#a0a0a0" stroked="f"/>
         </w:pict>
       </w:r>
     </w:p>
@@ -2010,7 +1925,7 @@
     <w:p>
       <w:r>
         <w:pict w14:anchorId="6085E523">
-          <v:rect id="_x0000_i1741" style="width:0;height:1.5pt" o:hralign="center" o:hrstd="t" o:hr="t" fillcolor="#a0a0a0" stroked="f"/>
+          <v:rect id="_x0000_i1039" style="width:0;height:1.5pt" o:hralign="center" o:hrstd="t" o:hr="t" fillcolor="#a0a0a0" stroked="f"/>
         </w:pict>
       </w:r>
     </w:p>
@@ -2049,7 +1964,7 @@
     <w:p>
       <w:r>
         <w:pict w14:anchorId="0BB45339">
-          <v:rect id="_x0000_i1742" style="width:0;height:1.5pt" o:hralign="center" o:hrstd="t" o:hr="t" fillcolor="#a0a0a0" stroked="f"/>
+          <v:rect id="_x0000_i1040" style="width:0;height:1.5pt" o:hralign="center" o:hrstd="t" o:hr="t" fillcolor="#a0a0a0" stroked="f"/>
         </w:pict>
       </w:r>
     </w:p>
@@ -6821,6 +6736,7 @@
   <w:style w:type="character" w:default="1" w:styleId="DefaultParagraphFont">
     <w:name w:val="Default Paragraph Font"/>
     <w:uiPriority w:val="1"/>
+    <w:semiHidden/>
     <w:unhideWhenUsed/>
   </w:style>
   <w:style w:type="table" w:default="1" w:styleId="TableNormal">

</xml_diff>